<commit_message>
Add pre-lab, glossary, model exhibit and speaker notes
</commit_message>
<xml_diff>
--- a/Lab 01/Lab 01 Working Paper - Introduction to Digital Forensics.docx
+++ b/Lab 01/Lab 01 Working Paper - Introduction to Digital Forensics.docx
@@ -1384,7 +1384,7 @@
           <w:sz w:val="22"/>
           <w:szCs w:val="22"/>
         </w:rPr>
-        <w:t xml:space="preserve">This working paper as PDF, named NIM_Name_Lab01.pdf.</w:t>
+        <w:t xml:space="preserve">Section 1.4 pre-lab, answered before the session (worth 10 points).</w:t>
       </w:r>
     </w:p>
     <w:p>
@@ -1404,7 +1404,7 @@
           <w:sz w:val="22"/>
           <w:szCs w:val="22"/>
         </w:rPr>
-        <w:t xml:space="preserve">Your evidence folder NIM_Lab01/evidence/ containing every numbered exhibit (B-01, B-02, and so on).</w:t>
+        <w:t xml:space="preserve">This working paper as PDF, named NIM_Name_Lab01.pdf.</w:t>
       </w:r>
     </w:p>
     <w:p>
@@ -1424,9 +1424,532 @@
           <w:sz w:val="22"/>
           <w:szCs w:val="22"/>
         </w:rPr>
+        <w:t xml:space="preserve">Your evidence folder NIM_Lab01/evidence/ containing every numbered exhibit (B-01, B-02, and so on).</w:t>
+      </w:r>
+    </w:p>
+    <w:p>
+      <w:pPr>
+        <w:pStyle w:val="ListParagraph"/>
+        <w:numPr>
+          <w:ilvl w:val="0"/>
+          <w:numId w:val="1"/>
+        </w:numPr>
+        <w:spacing w:after="60" w:line="312"/>
+        <w:jc w:val="both"/>
+      </w:pPr>
+      <w:r>
+        <w:rPr>
+          <w:rFonts w:ascii="Calibri" w:eastAsia="Microsoft YaHei"/>
+          <w:color w:val="1C262B"/>
+          <w:sz w:val="22"/>
+          <w:szCs w:val="22"/>
+        </w:rPr>
         <w:t xml:space="preserve">The two recovered challenge images (working copies only — originals must remain untouched).</w:t>
       </w:r>
     </w:p>
+    <w:p>
+      <w:pPr>
+        <w:pStyle w:val="Heading2"/>
+        <w:keepNext/>
+        <w:spacing w:after="120" w:before="260" w:line="312"/>
+      </w:pPr>
+      <w:r>
+        <w:rPr>
+          <w:rFonts w:ascii="Calibri" w:eastAsia="Microsoft YaHei"/>
+          <w:b/>
+          <w:bCs/>
+          <w:color w:val="1B6B7A"/>
+          <w:sz w:val="26"/>
+          <w:szCs w:val="26"/>
+        </w:rPr>
+        <w:t xml:space="preserve">1.4 Pre-Lab Check</w:t>
+      </w:r>
+    </w:p>
+    <w:p>
+      <w:pPr>
+        <w:keepNext w:val="false"/>
+        <w:spacing w:after="100" w:line="312"/>
+        <w:jc w:val="both"/>
+      </w:pPr>
+      <w:r>
+        <w:rPr>
+          <w:rFonts w:ascii="Calibri" w:eastAsia="Microsoft YaHei"/>
+          <w:b w:val="false"/>
+          <w:bCs w:val="false"/>
+          <w:i/>
+          <w:iCs/>
+          <w:color w:val="5B6B76"/>
+          <w:sz w:val="20"/>
+          <w:szCs w:val="20"/>
+        </w:rPr>
+        <w:t xml:space="preserve">Answer these before the session, using the lab README and Section 2 of this paper as references. One or two sentences per question are enough — precision beats length.</w:t>
+      </w:r>
+    </w:p>
+    <w:p>
+      <w:pPr>
+        <w:keepNext/>
+        <w:spacing w:after="80" w:before="140" w:line="312"/>
+        <w:jc w:val="both"/>
+      </w:pPr>
+      <w:r>
+        <w:rPr>
+          <w:rFonts w:ascii="Calibri" w:eastAsia="Microsoft YaHei"/>
+          <w:b/>
+          <w:bCs/>
+          <w:color w:val="0F3A47"/>
+          <w:sz w:val="22"/>
+          <w:szCs w:val="22"/>
+        </w:rPr>
+        <w:t xml:space="preserve">P1. </w:t>
+      </w:r>
+      <w:r>
+        <w:rPr>
+          <w:rFonts w:ascii="Calibri" w:eastAsia="Microsoft YaHei"/>
+          <w:color w:val="1C262B"/>
+          <w:sz w:val="22"/>
+          <w:szCs w:val="22"/>
+        </w:rPr>
+        <w:t xml:space="preserve">In your own words: what is digital forensics, and in which two situations is it applied?</w:t>
+      </w:r>
+    </w:p>
+    <w:tbl>
+      <w:tblPr>
+        <w:tblW w:type="pct" w:w="5000"/>
+        <w:tblBorders>
+          <w:top w:val="single" w:color="C5D3DA" w:sz="4"/>
+          <w:left w:val="single" w:color="C5D3DA" w:sz="4"/>
+          <w:bottom w:val="single" w:color="C5D3DA" w:sz="4"/>
+          <w:right w:val="single" w:color="C5D3DA" w:sz="4"/>
+          <w:insideH w:val="none" w:color="FFFFFF" w:sz="0"/>
+          <w:insideV w:val="none" w:color="FFFFFF" w:sz="0"/>
+        </w:tblBorders>
+        <w:tblLayout w:type="fixed"/>
+      </w:tblPr>
+      <w:tblGrid>
+        <w:gridCol w:w="8788"/>
+      </w:tblGrid>
+      <w:tr>
+        <w:trPr>
+          <w:cantSplit/>
+          <w:trHeight w:val="900" w:hRule="atLeast"/>
+        </w:trPr>
+        <w:tc>
+          <w:tcPr>
+            <w:shd w:fill="FAFCFD" w:val="clear"/>
+            <w:tcMar>
+              <w:top w:type="dxa" w:w="100"/>
+              <w:left w:type="dxa" w:w="160"/>
+              <w:bottom w:type="dxa" w:w="100"/>
+              <w:right w:type="dxa" w:w="160"/>
+            </w:tcMar>
+          </w:tcPr>
+          <w:p>
+            <w:pPr>
+              <w:spacing w:after="60" w:line="288"/>
+            </w:pPr>
+            <w:r>
+              <w:rPr>
+                <w:rFonts w:ascii="Calibri" w:eastAsia="Microsoft YaHei"/>
+                <w:b/>
+                <w:bCs/>
+                <w:color w:val="35505E"/>
+                <w:sz w:val="20"/>
+                <w:szCs w:val="20"/>
+              </w:rPr>
+              <w:t xml:space="preserve">Answer:</w:t>
+            </w:r>
+          </w:p>
+          <w:p>
+            <w:pPr>
+              <w:spacing w:after="0" w:line="288"/>
+            </w:pPr>
+            <w:r>
+              <w:rPr>
+                <w:rFonts w:ascii="Calibri" w:eastAsia="Microsoft YaHei"/>
+                <w:i/>
+                <w:iCs/>
+                <w:color w:val="8AA0AC"/>
+                <w:sz w:val="18"/>
+                <w:szCs w:val="18"/>
+              </w:rPr>
+              <w:t xml:space="preserve">Two sentences maximum.</w:t>
+            </w:r>
+          </w:p>
+        </w:tc>
+      </w:tr>
+    </w:tbl>
+    <w:p>
+      <w:pPr>
+        <w:keepNext/>
+        <w:spacing w:after="80" w:before="140" w:line="312"/>
+        <w:jc w:val="both"/>
+      </w:pPr>
+      <w:r>
+        <w:rPr>
+          <w:rFonts w:ascii="Calibri" w:eastAsia="Microsoft YaHei"/>
+          <w:b/>
+          <w:bCs/>
+          <w:color w:val="0F3A47"/>
+          <w:sz w:val="22"/>
+          <w:szCs w:val="22"/>
+        </w:rPr>
+        <w:t xml:space="preserve">P2. </w:t>
+      </w:r>
+      <w:r>
+        <w:rPr>
+          <w:rFonts w:ascii="Calibri" w:eastAsia="Microsoft YaHei"/>
+          <w:color w:val="1C262B"/>
+          <w:sz w:val="22"/>
+          <w:szCs w:val="22"/>
+        </w:rPr>
+        <w:t xml:space="preserve">A colleague says "these two files look identical, so they are identical." Which technique proves or disproves that claim, and how does it work?</w:t>
+      </w:r>
+    </w:p>
+    <w:tbl>
+      <w:tblPr>
+        <w:tblW w:type="pct" w:w="5000"/>
+        <w:tblBorders>
+          <w:top w:val="single" w:color="C5D3DA" w:sz="4"/>
+          <w:left w:val="single" w:color="C5D3DA" w:sz="4"/>
+          <w:bottom w:val="single" w:color="C5D3DA" w:sz="4"/>
+          <w:right w:val="single" w:color="C5D3DA" w:sz="4"/>
+          <w:insideH w:val="none" w:color="FFFFFF" w:sz="0"/>
+          <w:insideV w:val="none" w:color="FFFFFF" w:sz="0"/>
+        </w:tblBorders>
+        <w:tblLayout w:type="fixed"/>
+      </w:tblPr>
+      <w:tblGrid>
+        <w:gridCol w:w="8788"/>
+      </w:tblGrid>
+      <w:tr>
+        <w:trPr>
+          <w:cantSplit/>
+          <w:trHeight w:val="900" w:hRule="atLeast"/>
+        </w:trPr>
+        <w:tc>
+          <w:tcPr>
+            <w:shd w:fill="FAFCFD" w:val="clear"/>
+            <w:tcMar>
+              <w:top w:type="dxa" w:w="100"/>
+              <w:left w:type="dxa" w:w="160"/>
+              <w:bottom w:type="dxa" w:w="100"/>
+              <w:right w:type="dxa" w:w="160"/>
+            </w:tcMar>
+          </w:tcPr>
+          <w:p>
+            <w:pPr>
+              <w:spacing w:after="60" w:line="288"/>
+            </w:pPr>
+            <w:r>
+              <w:rPr>
+                <w:rFonts w:ascii="Calibri" w:eastAsia="Microsoft YaHei"/>
+                <w:b/>
+                <w:bCs/>
+                <w:color w:val="35505E"/>
+                <w:sz w:val="20"/>
+                <w:szCs w:val="20"/>
+              </w:rPr>
+              <w:t xml:space="preserve">Answer:</w:t>
+            </w:r>
+          </w:p>
+          <w:p>
+            <w:pPr>
+              <w:spacing w:after="0" w:line="288"/>
+            </w:pPr>
+            <w:r>
+              <w:rPr>
+                <w:rFonts w:ascii="Calibri" w:eastAsia="Microsoft YaHei"/>
+                <w:i/>
+                <w:iCs/>
+                <w:color w:val="8AA0AC"/>
+                <w:sz w:val="18"/>
+                <w:szCs w:val="18"/>
+              </w:rPr>
+              <w:t xml:space="preserve">Two sentences maximum.</w:t>
+            </w:r>
+          </w:p>
+        </w:tc>
+      </w:tr>
+    </w:tbl>
+    <w:p>
+      <w:pPr>
+        <w:keepNext/>
+        <w:spacing w:after="80" w:before="140" w:line="312"/>
+        <w:jc w:val="both"/>
+      </w:pPr>
+      <w:r>
+        <w:rPr>
+          <w:rFonts w:ascii="Calibri" w:eastAsia="Microsoft YaHei"/>
+          <w:b/>
+          <w:bCs/>
+          <w:color w:val="0F3A47"/>
+          <w:sz w:val="22"/>
+          <w:szCs w:val="22"/>
+        </w:rPr>
+        <w:t xml:space="preserve">P3. </w:t>
+      </w:r>
+      <w:r>
+        <w:rPr>
+          <w:rFonts w:ascii="Calibri" w:eastAsia="Microsoft YaHei"/>
+          <w:color w:val="1C262B"/>
+          <w:sz w:val="22"/>
+          <w:szCs w:val="22"/>
+        </w:rPr>
+        <w:t xml:space="preserve">What are magic bytes? Write the first four bytes of a PNG file in hexadecimal.</w:t>
+      </w:r>
+    </w:p>
+    <w:tbl>
+      <w:tblPr>
+        <w:tblW w:type="pct" w:w="5000"/>
+        <w:tblBorders>
+          <w:top w:val="single" w:color="C5D3DA" w:sz="4"/>
+          <w:left w:val="single" w:color="C5D3DA" w:sz="4"/>
+          <w:bottom w:val="single" w:color="C5D3DA" w:sz="4"/>
+          <w:right w:val="single" w:color="C5D3DA" w:sz="4"/>
+          <w:insideH w:val="none" w:color="FFFFFF" w:sz="0"/>
+          <w:insideV w:val="none" w:color="FFFFFF" w:sz="0"/>
+        </w:tblBorders>
+        <w:tblLayout w:type="fixed"/>
+      </w:tblPr>
+      <w:tblGrid>
+        <w:gridCol w:w="8788"/>
+      </w:tblGrid>
+      <w:tr>
+        <w:trPr>
+          <w:cantSplit/>
+          <w:trHeight w:val="900" w:hRule="atLeast"/>
+        </w:trPr>
+        <w:tc>
+          <w:tcPr>
+            <w:shd w:fill="FAFCFD" w:val="clear"/>
+            <w:tcMar>
+              <w:top w:type="dxa" w:w="100"/>
+              <w:left w:type="dxa" w:w="160"/>
+              <w:bottom w:type="dxa" w:w="100"/>
+              <w:right w:type="dxa" w:w="160"/>
+            </w:tcMar>
+          </w:tcPr>
+          <w:p>
+            <w:pPr>
+              <w:spacing w:after="60" w:line="288"/>
+            </w:pPr>
+            <w:r>
+              <w:rPr>
+                <w:rFonts w:ascii="Calibri" w:eastAsia="Microsoft YaHei"/>
+                <w:b/>
+                <w:bCs/>
+                <w:color w:val="35505E"/>
+                <w:sz w:val="20"/>
+                <w:szCs w:val="20"/>
+              </w:rPr>
+              <w:t xml:space="preserve">Answer:</w:t>
+            </w:r>
+          </w:p>
+          <w:p>
+            <w:pPr>
+              <w:spacing w:after="0" w:line="288"/>
+            </w:pPr>
+            <w:r>
+              <w:rPr>
+                <w:rFonts w:ascii="Calibri" w:eastAsia="Microsoft YaHei"/>
+                <w:i/>
+                <w:iCs/>
+                <w:color w:val="8AA0AC"/>
+                <w:sz w:val="18"/>
+                <w:szCs w:val="18"/>
+              </w:rPr>
+              <w:t xml:space="preserve">Two sentences maximum.</w:t>
+            </w:r>
+          </w:p>
+        </w:tc>
+      </w:tr>
+    </w:tbl>
+    <w:p>
+      <w:pPr>
+        <w:keepNext/>
+        <w:spacing w:after="80" w:before="140" w:line="312"/>
+        <w:jc w:val="both"/>
+      </w:pPr>
+      <w:r>
+        <w:rPr>
+          <w:rFonts w:ascii="Calibri" w:eastAsia="Microsoft YaHei"/>
+          <w:b/>
+          <w:bCs/>
+          <w:color w:val="0F3A47"/>
+          <w:sz w:val="22"/>
+          <w:szCs w:val="22"/>
+        </w:rPr>
+        <w:t xml:space="preserve">P4. </w:t>
+      </w:r>
+      <w:r>
+        <w:rPr>
+          <w:rFonts w:ascii="Calibri" w:eastAsia="Microsoft YaHei"/>
+          <w:color w:val="1C262B"/>
+          <w:sz w:val="22"/>
+          <w:szCs w:val="22"/>
+        </w:rPr>
+        <w:t xml:space="preserve">Why can a file named photo.jpg actually be something else entirely? Which command reveals its true type?</w:t>
+      </w:r>
+    </w:p>
+    <w:tbl>
+      <w:tblPr>
+        <w:tblW w:type="pct" w:w="5000"/>
+        <w:tblBorders>
+          <w:top w:val="single" w:color="C5D3DA" w:sz="4"/>
+          <w:left w:val="single" w:color="C5D3DA" w:sz="4"/>
+          <w:bottom w:val="single" w:color="C5D3DA" w:sz="4"/>
+          <w:right w:val="single" w:color="C5D3DA" w:sz="4"/>
+          <w:insideH w:val="none" w:color="FFFFFF" w:sz="0"/>
+          <w:insideV w:val="none" w:color="FFFFFF" w:sz="0"/>
+        </w:tblBorders>
+        <w:tblLayout w:type="fixed"/>
+      </w:tblPr>
+      <w:tblGrid>
+        <w:gridCol w:w="8788"/>
+      </w:tblGrid>
+      <w:tr>
+        <w:trPr>
+          <w:cantSplit/>
+          <w:trHeight w:val="900" w:hRule="atLeast"/>
+        </w:trPr>
+        <w:tc>
+          <w:tcPr>
+            <w:shd w:fill="FAFCFD" w:val="clear"/>
+            <w:tcMar>
+              <w:top w:type="dxa" w:w="100"/>
+              <w:left w:type="dxa" w:w="160"/>
+              <w:bottom w:type="dxa" w:w="100"/>
+              <w:right w:type="dxa" w:w="160"/>
+            </w:tcMar>
+          </w:tcPr>
+          <w:p>
+            <w:pPr>
+              <w:spacing w:after="60" w:line="288"/>
+            </w:pPr>
+            <w:r>
+              <w:rPr>
+                <w:rFonts w:ascii="Calibri" w:eastAsia="Microsoft YaHei"/>
+                <w:b/>
+                <w:bCs/>
+                <w:color w:val="35505E"/>
+                <w:sz w:val="20"/>
+                <w:szCs w:val="20"/>
+              </w:rPr>
+              <w:t xml:space="preserve">Answer:</w:t>
+            </w:r>
+          </w:p>
+          <w:p>
+            <w:pPr>
+              <w:spacing w:after="0" w:line="288"/>
+            </w:pPr>
+            <w:r>
+              <w:rPr>
+                <w:rFonts w:ascii="Calibri" w:eastAsia="Microsoft YaHei"/>
+                <w:i/>
+                <w:iCs/>
+                <w:color w:val="8AA0AC"/>
+                <w:sz w:val="18"/>
+                <w:szCs w:val="18"/>
+              </w:rPr>
+              <w:t xml:space="preserve">Two sentences maximum.</w:t>
+            </w:r>
+          </w:p>
+        </w:tc>
+      </w:tr>
+    </w:tbl>
+    <w:p>
+      <w:pPr>
+        <w:keepNext/>
+        <w:spacing w:after="80" w:before="140" w:line="312"/>
+        <w:jc w:val="both"/>
+      </w:pPr>
+      <w:r>
+        <w:rPr>
+          <w:rFonts w:ascii="Calibri" w:eastAsia="Microsoft YaHei"/>
+          <w:b/>
+          <w:bCs/>
+          <w:color w:val="0F3A47"/>
+          <w:sz w:val="22"/>
+          <w:szCs w:val="22"/>
+        </w:rPr>
+        <w:t xml:space="preserve">P5. </w:t>
+      </w:r>
+      <w:r>
+        <w:rPr>
+          <w:rFonts w:ascii="Calibri" w:eastAsia="Microsoft YaHei"/>
+          <w:color w:val="1C262B"/>
+          <w:sz w:val="22"/>
+          <w:szCs w:val="22"/>
+        </w:rPr>
+        <w:t xml:space="preserve">What does the pipe symbol | do between two commands? (One sentence — the Deep Dive deck expands on this.)</w:t>
+      </w:r>
+    </w:p>
+    <w:tbl>
+      <w:tblPr>
+        <w:tblW w:type="pct" w:w="5000"/>
+        <w:tblBorders>
+          <w:top w:val="single" w:color="C5D3DA" w:sz="4"/>
+          <w:left w:val="single" w:color="C5D3DA" w:sz="4"/>
+          <w:bottom w:val="single" w:color="C5D3DA" w:sz="4"/>
+          <w:right w:val="single" w:color="C5D3DA" w:sz="4"/>
+          <w:insideH w:val="none" w:color="FFFFFF" w:sz="0"/>
+          <w:insideV w:val="none" w:color="FFFFFF" w:sz="0"/>
+        </w:tblBorders>
+        <w:tblLayout w:type="fixed"/>
+      </w:tblPr>
+      <w:tblGrid>
+        <w:gridCol w:w="8788"/>
+      </w:tblGrid>
+      <w:tr>
+        <w:trPr>
+          <w:cantSplit/>
+          <w:trHeight w:val="900" w:hRule="atLeast"/>
+        </w:trPr>
+        <w:tc>
+          <w:tcPr>
+            <w:shd w:fill="FAFCFD" w:val="clear"/>
+            <w:tcMar>
+              <w:top w:type="dxa" w:w="100"/>
+              <w:left w:type="dxa" w:w="160"/>
+              <w:bottom w:type="dxa" w:w="100"/>
+              <w:right w:type="dxa" w:w="160"/>
+            </w:tcMar>
+          </w:tcPr>
+          <w:p>
+            <w:pPr>
+              <w:spacing w:after="60" w:line="288"/>
+            </w:pPr>
+            <w:r>
+              <w:rPr>
+                <w:rFonts w:ascii="Calibri" w:eastAsia="Microsoft YaHei"/>
+                <w:b/>
+                <w:bCs/>
+                <w:color w:val="35505E"/>
+                <w:sz w:val="20"/>
+                <w:szCs w:val="20"/>
+              </w:rPr>
+              <w:t xml:space="preserve">Answer:</w:t>
+            </w:r>
+          </w:p>
+          <w:p>
+            <w:pPr>
+              <w:spacing w:after="0" w:line="288"/>
+            </w:pPr>
+            <w:r>
+              <w:rPr>
+                <w:rFonts w:ascii="Calibri" w:eastAsia="Microsoft YaHei"/>
+                <w:i/>
+                <w:iCs/>
+                <w:color w:val="8AA0AC"/>
+                <w:sz w:val="18"/>
+                <w:szCs w:val="18"/>
+              </w:rPr>
+              <w:t xml:space="preserve">Two sentences maximum.</w:t>
+            </w:r>
+          </w:p>
+        </w:tc>
+      </w:tr>
+    </w:tbl>
     <w:p>
       <w:pPr>
         <w:pStyle w:val="Heading1"/>
@@ -9291,7 +9814,7 @@
     <w:p>
       <w:pPr>
         <w:keepNext w:val="false"/>
-        <w:spacing w:after="80" w:line="312"/>
+        <w:spacing w:after="100" w:line="312"/>
         <w:jc w:val="both"/>
       </w:pPr>
       <w:r>
@@ -9306,6 +9829,170 @@
           <w:szCs w:val="20"/>
         </w:rPr>
         <w:t xml:space="preserve">One row per exhibit. Keep numbering continuous across the whole session.</w:t>
+      </w:r>
+    </w:p>
+    <w:p>
+      <w:pPr>
+        <w:keepNext/>
+        <w:spacing w:after="60" w:line="312"/>
+        <w:jc w:val="both"/>
+      </w:pPr>
+      <w:r>
+        <w:rPr>
+          <w:rFonts w:ascii="Calibri" w:eastAsia="Microsoft YaHei"/>
+          <w:b/>
+          <w:bCs/>
+          <w:i w:val="false"/>
+          <w:iCs w:val="false"/>
+          <w:color w:val="1C262B"/>
+          <w:sz w:val="22"/>
+          <w:szCs w:val="22"/>
+        </w:rPr>
+        <w:t xml:space="preserve">What good evidence looks like — model exhibit:</w:t>
+      </w:r>
+    </w:p>
+    <w:p>
+      <w:pPr>
+        <w:shd w:fill="EDF3F5" w:val="clear"/>
+        <w:spacing w:after="40" w:line="288"/>
+        <w:ind w:left="360"/>
+      </w:pPr>
+      <w:r>
+        <w:rPr>
+          <w:rFonts w:ascii="Consolas" w:eastAsia="Microsoft YaHei"/>
+          <w:color w:val="24404C"/>
+          <w:sz w:val="19"/>
+          <w:szCs w:val="19"/>
+        </w:rPr>
+        <w:t xml:space="preserve">[B-03] 2026-09-30 09:14   analyst@kali:~/forensics/lab01</w:t>
+      </w:r>
+    </w:p>
+    <w:p>
+      <w:pPr>
+        <w:shd w:fill="EDF3F5" w:val="clear"/>
+        <w:spacing w:after="40" w:line="288"/>
+        <w:ind w:left="360"/>
+      </w:pPr>
+      <w:r>
+        <w:rPr>
+          <w:rFonts w:ascii="Consolas" w:eastAsia="Microsoft YaHei"/>
+          <w:color w:val="24404C"/>
+          <w:sz w:val="19"/>
+          <w:szCs w:val="19"/>
+        </w:rPr>
+        <w:t xml:space="preserve">$ strings -n 8 update.bin | grep http</w:t>
+      </w:r>
+    </w:p>
+    <w:p>
+      <w:pPr>
+        <w:shd w:fill="EDF3F5" w:val="clear"/>
+        <w:spacing w:after="40" w:line="288"/>
+        <w:ind w:left="360"/>
+      </w:pPr>
+      <w:r>
+        <w:rPr>
+          <w:rFonts w:ascii="Consolas" w:eastAsia="Microsoft YaHei"/>
+          <w:color w:val="24404C"/>
+          <w:sz w:val="19"/>
+          <w:szCs w:val="19"/>
+        </w:rPr>
+        <w:t xml:space="preserve">https://pastebin.example/raw/zK9fQ2</w:t>
+      </w:r>
+    </w:p>
+    <w:p>
+      <w:pPr>
+        <w:shd w:fill="EDF3F5" w:val="clear"/>
+        <w:spacing w:after="40" w:line="288"/>
+        <w:ind w:left="360"/>
+      </w:pPr>
+      <w:r>
+        <w:rPr>
+          <w:rFonts w:ascii="Consolas" w:eastAsia="Microsoft YaHei"/>
+          <w:color w:val="24404C"/>
+          <w:sz w:val="19"/>
+          <w:szCs w:val="19"/>
+        </w:rPr>
+        <w:t xml:space="preserve">-&gt; captured as evidence/B-03_strings_update.png</w:t>
+      </w:r>
+    </w:p>
+    <w:p>
+      <w:pPr>
+        <w:pStyle w:val="ListParagraph"/>
+        <w:numPr>
+          <w:ilvl w:val="0"/>
+          <w:numId w:val="1"/>
+        </w:numPr>
+        <w:spacing w:after="60" w:line="312"/>
+        <w:jc w:val="both"/>
+      </w:pPr>
+      <w:r>
+        <w:rPr>
+          <w:rFonts w:ascii="Calibri" w:eastAsia="Microsoft YaHei"/>
+          <w:color w:val="1C262B"/>
+          <w:sz w:val="22"/>
+          <w:szCs w:val="22"/>
+        </w:rPr>
+        <w:t xml:space="preserve">The command AND its output are both fully visible — not a cropped piece of text.</w:t>
+      </w:r>
+    </w:p>
+    <w:p>
+      <w:pPr>
+        <w:pStyle w:val="ListParagraph"/>
+        <w:numPr>
+          <w:ilvl w:val="0"/>
+          <w:numId w:val="1"/>
+        </w:numPr>
+        <w:spacing w:after="60" w:line="312"/>
+        <w:jc w:val="both"/>
+      </w:pPr>
+      <w:r>
+        <w:rPr>
+          <w:rFonts w:ascii="Calibri" w:eastAsia="Microsoft YaHei"/>
+          <w:color w:val="1C262B"/>
+          <w:sz w:val="22"/>
+          <w:szCs w:val="22"/>
+        </w:rPr>
+        <w:t xml:space="preserve">The moment of capture is recorded (date and time), and the screenshot filename says what it shows.</w:t>
+      </w:r>
+    </w:p>
+    <w:p>
+      <w:pPr>
+        <w:pStyle w:val="ListParagraph"/>
+        <w:numPr>
+          <w:ilvl w:val="0"/>
+          <w:numId w:val="1"/>
+        </w:numPr>
+        <w:spacing w:after="60" w:line="312"/>
+        <w:jc w:val="both"/>
+      </w:pPr>
+      <w:r>
+        <w:rPr>
+          <w:rFonts w:ascii="Calibri" w:eastAsia="Microsoft YaHei"/>
+          <w:color w:val="1C262B"/>
+          <w:sz w:val="22"/>
+          <w:szCs w:val="22"/>
+        </w:rPr>
+        <w:t xml:space="preserve">One exhibit supports one finding; a new finding gets a new number (B-04, B-05, and so on).</w:t>
+      </w:r>
+    </w:p>
+    <w:p>
+      <w:pPr>
+        <w:pStyle w:val="ListParagraph"/>
+        <w:numPr>
+          <w:ilvl w:val="0"/>
+          <w:numId w:val="1"/>
+        </w:numPr>
+        <w:spacing w:after="60" w:line="312"/>
+        <w:jc w:val="both"/>
+      </w:pPr>
+      <w:r>
+        <w:rPr>
+          <w:rFonts w:ascii="Calibri" w:eastAsia="Microsoft YaHei"/>
+          <w:color w:val="1C262B"/>
+          <w:sz w:val="22"/>
+          <w:szCs w:val="22"/>
+        </w:rPr>
+        <w:t xml:space="preserve">Bad evidence looks like: a cropped image with no command line, an output with no context of where it ran, or five different findings squeezed into one screenshot.</w:t>
       </w:r>
     </w:p>
     <w:tbl>
@@ -12316,6 +13003,1242 @@
                 <w:szCs w:val="20"/>
               </w:rPr>
               <w:t xml:space="preserve">Yes / No</w:t>
+            </w:r>
+          </w:p>
+        </w:tc>
+      </w:tr>
+    </w:tbl>
+    <w:p>
+      <w:pPr>
+        <w:pStyle w:val="Heading2"/>
+        <w:keepNext/>
+        <w:spacing w:after="120" w:before="260" w:line="312"/>
+      </w:pPr>
+      <w:r>
+        <w:rPr>
+          <w:rFonts w:ascii="Calibri" w:eastAsia="Microsoft YaHei"/>
+          <w:b/>
+          <w:bCs/>
+          <w:color w:val="1B6B7A"/>
+          <w:sz w:val="26"/>
+          <w:szCs w:val="26"/>
+        </w:rPr>
+        <w:t xml:space="preserve">Appendix D — Glossary</w:t>
+      </w:r>
+    </w:p>
+    <w:tbl>
+      <w:tblPr>
+        <w:tblW w:type="pct" w:w="5000"/>
+        <w:tblBorders>
+          <w:top w:val="single" w:color="1B6B7A" w:sz="2"/>
+          <w:left w:val="none" w:color="FFFFFF" w:sz="0"/>
+          <w:bottom w:val="single" w:color="1B6B7A" w:sz="2"/>
+          <w:right w:val="none" w:color="FFFFFF" w:sz="0"/>
+          <w:insideH w:val="single" w:color="C8DDE2" w:sz="1"/>
+          <w:insideV w:val="single" w:color="C8DDE2" w:sz="1"/>
+        </w:tblBorders>
+        <w:tblLayout w:type="fixed"/>
+      </w:tblPr>
+      <w:tblGrid>
+        <w:gridCol w:w="2109"/>
+        <w:gridCol w:w="6679"/>
+      </w:tblGrid>
+      <w:tr>
+        <w:trPr>
+          <w:cantSplit/>
+          <w:tblHeader/>
+        </w:trPr>
+        <w:tc>
+          <w:tcPr>
+            <w:tcW w:type="pct" w:w="1200"/>
+            <w:shd w:fill="1B6B7A" w:val="clear"/>
+            <w:tcMar>
+              <w:top w:type="dxa" w:w="70"/>
+              <w:left w:type="dxa" w:w="110"/>
+              <w:bottom w:type="dxa" w:w="70"/>
+              <w:right w:type="dxa" w:w="110"/>
+            </w:tcMar>
+            <w:vAlign w:val="center"/>
+          </w:tcPr>
+          <w:p>
+            <w:pPr>
+              <w:spacing w:after="0" w:line="276"/>
+              <w:jc w:val="left"/>
+            </w:pPr>
+            <w:r>
+              <w:rPr>
+                <w:rFonts w:ascii="Calibri" w:eastAsia="Microsoft YaHei"/>
+                <w:b/>
+                <w:bCs/>
+                <w:color w:val="FFFFFF"/>
+                <w:sz w:val="20"/>
+                <w:szCs w:val="20"/>
+              </w:rPr>
+              <w:t xml:space="preserve">Term</w:t>
+            </w:r>
+          </w:p>
+        </w:tc>
+        <w:tc>
+          <w:tcPr>
+            <w:tcW w:type="pct" w:w="3800"/>
+            <w:shd w:fill="1B6B7A" w:val="clear"/>
+            <w:tcMar>
+              <w:top w:type="dxa" w:w="70"/>
+              <w:left w:type="dxa" w:w="110"/>
+              <w:bottom w:type="dxa" w:w="70"/>
+              <w:right w:type="dxa" w:w="110"/>
+            </w:tcMar>
+            <w:vAlign w:val="center"/>
+          </w:tcPr>
+          <w:p>
+            <w:pPr>
+              <w:spacing w:after="0" w:line="276"/>
+              <w:jc w:val="left"/>
+            </w:pPr>
+            <w:r>
+              <w:rPr>
+                <w:rFonts w:ascii="Calibri" w:eastAsia="Microsoft YaHei"/>
+                <w:b/>
+                <w:bCs/>
+                <w:color w:val="FFFFFF"/>
+                <w:sz w:val="20"/>
+                <w:szCs w:val="20"/>
+              </w:rPr>
+              <w:t xml:space="preserve">Meaning in this lab</w:t>
+            </w:r>
+          </w:p>
+        </w:tc>
+      </w:tr>
+      <w:tr>
+        <w:trPr>
+          <w:cantSplit/>
+        </w:trPr>
+        <w:tc>
+          <w:tcPr>
+            <w:tcW w:type="pct" w:w="1200"/>
+            <w:shd w:fill="FFFFFF" w:val="clear"/>
+            <w:tcMar>
+              <w:top w:type="dxa" w:w="60"/>
+              <w:left w:type="dxa" w:w="110"/>
+              <w:bottom w:type="dxa" w:w="60"/>
+              <w:right w:type="dxa" w:w="110"/>
+            </w:tcMar>
+          </w:tcPr>
+          <w:p>
+            <w:pPr>
+              <w:spacing w:after="0" w:line="276"/>
+              <w:jc w:val="left"/>
+            </w:pPr>
+            <w:r>
+              <w:rPr>
+                <w:rFonts w:ascii="Calibri" w:eastAsia="Microsoft YaHei"/>
+                <w:b w:val="false"/>
+                <w:bCs w:val="false"/>
+                <w:color w:val="1C262B"/>
+                <w:sz w:val="20"/>
+                <w:szCs w:val="20"/>
+              </w:rPr>
+              <w:t xml:space="preserve">magic bytes</w:t>
+            </w:r>
+          </w:p>
+        </w:tc>
+        <w:tc>
+          <w:tcPr>
+            <w:tcW w:type="pct" w:w="3800"/>
+            <w:shd w:fill="FFFFFF" w:val="clear"/>
+            <w:tcMar>
+              <w:top w:type="dxa" w:w="60"/>
+              <w:left w:type="dxa" w:w="110"/>
+              <w:bottom w:type="dxa" w:w="60"/>
+              <w:right w:type="dxa" w:w="110"/>
+            </w:tcMar>
+          </w:tcPr>
+          <w:p>
+            <w:pPr>
+              <w:spacing w:after="0" w:line="276"/>
+              <w:jc w:val="left"/>
+            </w:pPr>
+            <w:r>
+              <w:rPr>
+                <w:rFonts w:ascii="Calibri" w:eastAsia="Microsoft YaHei"/>
+                <w:b w:val="false"/>
+                <w:bCs w:val="false"/>
+                <w:color w:val="1C262B"/>
+                <w:sz w:val="20"/>
+                <w:szCs w:val="20"/>
+              </w:rPr>
+              <w:t xml:space="preserve">the fixed byte sequence at the start of a file that identifies its real format</w:t>
+            </w:r>
+          </w:p>
+        </w:tc>
+      </w:tr>
+      <w:tr>
+        <w:trPr>
+          <w:cantSplit/>
+        </w:trPr>
+        <w:tc>
+          <w:tcPr>
+            <w:tcW w:type="pct" w:w="1200"/>
+            <w:shd w:fill="FFFFFF" w:val="clear"/>
+            <w:tcMar>
+              <w:top w:type="dxa" w:w="60"/>
+              <w:left w:type="dxa" w:w="110"/>
+              <w:bottom w:type="dxa" w:w="60"/>
+              <w:right w:type="dxa" w:w="110"/>
+            </w:tcMar>
+          </w:tcPr>
+          <w:p>
+            <w:pPr>
+              <w:spacing w:after="0" w:line="276"/>
+              <w:jc w:val="left"/>
+            </w:pPr>
+            <w:r>
+              <w:rPr>
+                <w:rFonts w:ascii="Calibri" w:eastAsia="Microsoft YaHei"/>
+                <w:b w:val="false"/>
+                <w:bCs w:val="false"/>
+                <w:color w:val="1C262B"/>
+                <w:sz w:val="20"/>
+                <w:szCs w:val="20"/>
+              </w:rPr>
+              <w:t xml:space="preserve">hash / checksum</w:t>
+            </w:r>
+          </w:p>
+        </w:tc>
+        <w:tc>
+          <w:tcPr>
+            <w:tcW w:type="pct" w:w="3800"/>
+            <w:shd w:fill="FFFFFF" w:val="clear"/>
+            <w:tcMar>
+              <w:top w:type="dxa" w:w="60"/>
+              <w:left w:type="dxa" w:w="110"/>
+              <w:bottom w:type="dxa" w:w="60"/>
+              <w:right w:type="dxa" w:w="110"/>
+            </w:tcMar>
+          </w:tcPr>
+          <w:p>
+            <w:pPr>
+              <w:spacing w:after="0" w:line="276"/>
+              <w:jc w:val="left"/>
+            </w:pPr>
+            <w:r>
+              <w:rPr>
+                <w:rFonts w:ascii="Calibri" w:eastAsia="Microsoft YaHei"/>
+                <w:b w:val="false"/>
+                <w:bCs w:val="false"/>
+                <w:color w:val="1C262B"/>
+                <w:sz w:val="20"/>
+                <w:szCs w:val="20"/>
+              </w:rPr>
+              <w:t xml:space="preserve">a fixed-length fingerprint of a file's content; identical content always yields the same value</w:t>
+            </w:r>
+          </w:p>
+        </w:tc>
+      </w:tr>
+      <w:tr>
+        <w:trPr>
+          <w:cantSplit/>
+        </w:trPr>
+        <w:tc>
+          <w:tcPr>
+            <w:tcW w:type="pct" w:w="1200"/>
+            <w:shd w:fill="FFFFFF" w:val="clear"/>
+            <w:tcMar>
+              <w:top w:type="dxa" w:w="60"/>
+              <w:left w:type="dxa" w:w="110"/>
+              <w:bottom w:type="dxa" w:w="60"/>
+              <w:right w:type="dxa" w:w="110"/>
+            </w:tcMar>
+          </w:tcPr>
+          <w:p>
+            <w:pPr>
+              <w:spacing w:after="0" w:line="276"/>
+              <w:jc w:val="left"/>
+            </w:pPr>
+            <w:r>
+              <w:rPr>
+                <w:rFonts w:ascii="Calibri" w:eastAsia="Microsoft YaHei"/>
+                <w:b w:val="false"/>
+                <w:bCs w:val="false"/>
+                <w:color w:val="1C262B"/>
+                <w:sz w:val="20"/>
+                <w:szCs w:val="20"/>
+              </w:rPr>
+              <w:t xml:space="preserve">avalanche effect</w:t>
+            </w:r>
+          </w:p>
+        </w:tc>
+        <w:tc>
+          <w:tcPr>
+            <w:tcW w:type="pct" w:w="3800"/>
+            <w:shd w:fill="FFFFFF" w:val="clear"/>
+            <w:tcMar>
+              <w:top w:type="dxa" w:w="60"/>
+              <w:left w:type="dxa" w:w="110"/>
+              <w:bottom w:type="dxa" w:w="60"/>
+              <w:right w:type="dxa" w:w="110"/>
+            </w:tcMar>
+          </w:tcPr>
+          <w:p>
+            <w:pPr>
+              <w:spacing w:after="0" w:line="276"/>
+              <w:jc w:val="left"/>
+            </w:pPr>
+            <w:r>
+              <w:rPr>
+                <w:rFonts w:ascii="Calibri" w:eastAsia="Microsoft YaHei"/>
+                <w:b w:val="false"/>
+                <w:bCs w:val="false"/>
+                <w:color w:val="1C262B"/>
+                <w:sz w:val="20"/>
+                <w:szCs w:val="20"/>
+              </w:rPr>
+              <w:t xml:space="preserve">changing one bit of input changes the hash completely</w:t>
+            </w:r>
+          </w:p>
+        </w:tc>
+      </w:tr>
+      <w:tr>
+        <w:trPr>
+          <w:cantSplit/>
+        </w:trPr>
+        <w:tc>
+          <w:tcPr>
+            <w:tcW w:type="pct" w:w="1200"/>
+            <w:shd w:fill="FFFFFF" w:val="clear"/>
+            <w:tcMar>
+              <w:top w:type="dxa" w:w="60"/>
+              <w:left w:type="dxa" w:w="110"/>
+              <w:bottom w:type="dxa" w:w="60"/>
+              <w:right w:type="dxa" w:w="110"/>
+            </w:tcMar>
+          </w:tcPr>
+          <w:p>
+            <w:pPr>
+              <w:spacing w:after="0" w:line="276"/>
+              <w:jc w:val="left"/>
+            </w:pPr>
+            <w:r>
+              <w:rPr>
+                <w:rFonts w:ascii="Calibri" w:eastAsia="Microsoft YaHei"/>
+                <w:b w:val="false"/>
+                <w:bCs w:val="false"/>
+                <w:color w:val="1C262B"/>
+                <w:sz w:val="20"/>
+                <w:szCs w:val="20"/>
+              </w:rPr>
+              <w:t xml:space="preserve">working copy</w:t>
+            </w:r>
+          </w:p>
+        </w:tc>
+        <w:tc>
+          <w:tcPr>
+            <w:tcW w:type="pct" w:w="3800"/>
+            <w:shd w:fill="FFFFFF" w:val="clear"/>
+            <w:tcMar>
+              <w:top w:type="dxa" w:w="60"/>
+              <w:left w:type="dxa" w:w="110"/>
+              <w:bottom w:type="dxa" w:w="60"/>
+              <w:right w:type="dxa" w:w="110"/>
+            </w:tcMar>
+          </w:tcPr>
+          <w:p>
+            <w:pPr>
+              <w:spacing w:after="0" w:line="276"/>
+              <w:jc w:val="left"/>
+            </w:pPr>
+            <w:r>
+              <w:rPr>
+                <w:rFonts w:ascii="Calibri" w:eastAsia="Microsoft YaHei"/>
+                <w:b w:val="false"/>
+                <w:bCs w:val="false"/>
+                <w:color w:val="1C262B"/>
+                <w:sz w:val="20"/>
+                <w:szCs w:val="20"/>
+              </w:rPr>
+              <w:t xml:space="preserve">the copy you analyze; the original evidence file stays sealed and untouched</w:t>
+            </w:r>
+          </w:p>
+        </w:tc>
+      </w:tr>
+      <w:tr>
+        <w:trPr>
+          <w:cantSplit/>
+        </w:trPr>
+        <w:tc>
+          <w:tcPr>
+            <w:tcW w:type="pct" w:w="1200"/>
+            <w:shd w:fill="FFFFFF" w:val="clear"/>
+            <w:tcMar>
+              <w:top w:type="dxa" w:w="60"/>
+              <w:left w:type="dxa" w:w="110"/>
+              <w:bottom w:type="dxa" w:w="60"/>
+              <w:right w:type="dxa" w:w="110"/>
+            </w:tcMar>
+          </w:tcPr>
+          <w:p>
+            <w:pPr>
+              <w:spacing w:after="0" w:line="276"/>
+              <w:jc w:val="left"/>
+            </w:pPr>
+            <w:r>
+              <w:rPr>
+                <w:rFonts w:ascii="Calibri" w:eastAsia="Microsoft YaHei"/>
+                <w:b w:val="false"/>
+                <w:bCs w:val="false"/>
+                <w:color w:val="1C262B"/>
+                <w:sz w:val="20"/>
+                <w:szCs w:val="20"/>
+              </w:rPr>
+              <w:t xml:space="preserve">chain of custody</w:t>
+            </w:r>
+          </w:p>
+        </w:tc>
+        <w:tc>
+          <w:tcPr>
+            <w:tcW w:type="pct" w:w="3800"/>
+            <w:shd w:fill="FFFFFF" w:val="clear"/>
+            <w:tcMar>
+              <w:top w:type="dxa" w:w="60"/>
+              <w:left w:type="dxa" w:w="110"/>
+              <w:bottom w:type="dxa" w:w="60"/>
+              <w:right w:type="dxa" w:w="110"/>
+            </w:tcMar>
+          </w:tcPr>
+          <w:p>
+            <w:pPr>
+              <w:spacing w:after="0" w:line="276"/>
+              <w:jc w:val="left"/>
+            </w:pPr>
+            <w:r>
+              <w:rPr>
+                <w:rFonts w:ascii="Calibri" w:eastAsia="Microsoft YaHei"/>
+                <w:b w:val="false"/>
+                <w:bCs w:val="false"/>
+                <w:color w:val="1C262B"/>
+                <w:sz w:val="20"/>
+                <w:szCs w:val="20"/>
+              </w:rPr>
+              <w:t xml:space="preserve">the documented trail showing who held the evidence and that it was never altered</w:t>
+            </w:r>
+          </w:p>
+        </w:tc>
+      </w:tr>
+      <w:tr>
+        <w:trPr>
+          <w:cantSplit/>
+        </w:trPr>
+        <w:tc>
+          <w:tcPr>
+            <w:tcW w:type="pct" w:w="1200"/>
+            <w:shd w:fill="FFFFFF" w:val="clear"/>
+            <w:tcMar>
+              <w:top w:type="dxa" w:w="60"/>
+              <w:left w:type="dxa" w:w="110"/>
+              <w:bottom w:type="dxa" w:w="60"/>
+              <w:right w:type="dxa" w:w="110"/>
+            </w:tcMar>
+          </w:tcPr>
+          <w:p>
+            <w:pPr>
+              <w:spacing w:after="0" w:line="276"/>
+              <w:jc w:val="left"/>
+            </w:pPr>
+            <w:r>
+              <w:rPr>
+                <w:rFonts w:ascii="Calibri" w:eastAsia="Microsoft YaHei"/>
+                <w:b w:val="false"/>
+                <w:bCs w:val="false"/>
+                <w:color w:val="1C262B"/>
+                <w:sz w:val="20"/>
+                <w:szCs w:val="20"/>
+              </w:rPr>
+              <w:t xml:space="preserve">exhibit (B-number)</w:t>
+            </w:r>
+          </w:p>
+        </w:tc>
+        <w:tc>
+          <w:tcPr>
+            <w:tcW w:type="pct" w:w="3800"/>
+            <w:shd w:fill="FFFFFF" w:val="clear"/>
+            <w:tcMar>
+              <w:top w:type="dxa" w:w="60"/>
+              <w:left w:type="dxa" w:w="110"/>
+              <w:bottom w:type="dxa" w:w="60"/>
+              <w:right w:type="dxa" w:w="110"/>
+            </w:tcMar>
+          </w:tcPr>
+          <w:p>
+            <w:pPr>
+              <w:spacing w:after="0" w:line="276"/>
+              <w:jc w:val="left"/>
+            </w:pPr>
+            <w:r>
+              <w:rPr>
+                <w:rFonts w:ascii="Calibri" w:eastAsia="Microsoft YaHei"/>
+                <w:b w:val="false"/>
+                <w:bCs w:val="false"/>
+                <w:color w:val="1C262B"/>
+                <w:sz w:val="20"/>
+                <w:szCs w:val="20"/>
+              </w:rPr>
+              <w:t xml:space="preserve">one numbered, captured proof (screenshot or output) supporting one finding</w:t>
+            </w:r>
+          </w:p>
+        </w:tc>
+      </w:tr>
+      <w:tr>
+        <w:trPr>
+          <w:cantSplit/>
+        </w:trPr>
+        <w:tc>
+          <w:tcPr>
+            <w:tcW w:type="pct" w:w="1200"/>
+            <w:shd w:fill="FFFFFF" w:val="clear"/>
+            <w:tcMar>
+              <w:top w:type="dxa" w:w="60"/>
+              <w:left w:type="dxa" w:w="110"/>
+              <w:bottom w:type="dxa" w:w="60"/>
+              <w:right w:type="dxa" w:w="110"/>
+            </w:tcMar>
+          </w:tcPr>
+          <w:p>
+            <w:pPr>
+              <w:spacing w:after="0" w:line="276"/>
+              <w:jc w:val="left"/>
+            </w:pPr>
+            <w:r>
+              <w:rPr>
+                <w:rFonts w:ascii="Calibri" w:eastAsia="Microsoft YaHei"/>
+                <w:b w:val="false"/>
+                <w:bCs w:val="false"/>
+                <w:color w:val="1C262B"/>
+                <w:sz w:val="20"/>
+                <w:szCs w:val="20"/>
+              </w:rPr>
+              <w:t xml:space="preserve">mtime / atime / ctime</w:t>
+            </w:r>
+          </w:p>
+        </w:tc>
+        <w:tc>
+          <w:tcPr>
+            <w:tcW w:type="pct" w:w="3800"/>
+            <w:shd w:fill="FFFFFF" w:val="clear"/>
+            <w:tcMar>
+              <w:top w:type="dxa" w:w="60"/>
+              <w:left w:type="dxa" w:w="110"/>
+              <w:bottom w:type="dxa" w:w="60"/>
+              <w:right w:type="dxa" w:w="110"/>
+            </w:tcMar>
+          </w:tcPr>
+          <w:p>
+            <w:pPr>
+              <w:spacing w:after="0" w:line="276"/>
+              <w:jc w:val="left"/>
+            </w:pPr>
+            <w:r>
+              <w:rPr>
+                <w:rFonts w:ascii="Calibri" w:eastAsia="Microsoft YaHei"/>
+                <w:b w:val="false"/>
+                <w:bCs w:val="false"/>
+                <w:color w:val="1C262B"/>
+                <w:sz w:val="20"/>
+                <w:szCs w:val="20"/>
+              </w:rPr>
+              <w:t xml:space="preserve">last modified / accessed / metadata-changed timestamps of a file</w:t>
+            </w:r>
+          </w:p>
+        </w:tc>
+      </w:tr>
+      <w:tr>
+        <w:trPr>
+          <w:cantSplit/>
+        </w:trPr>
+        <w:tc>
+          <w:tcPr>
+            <w:tcW w:type="pct" w:w="1200"/>
+            <w:shd w:fill="FFFFFF" w:val="clear"/>
+            <w:tcMar>
+              <w:top w:type="dxa" w:w="60"/>
+              <w:left w:type="dxa" w:w="110"/>
+              <w:bottom w:type="dxa" w:w="60"/>
+              <w:right w:type="dxa" w:w="110"/>
+            </w:tcMar>
+          </w:tcPr>
+          <w:p>
+            <w:pPr>
+              <w:spacing w:after="0" w:line="276"/>
+              <w:jc w:val="left"/>
+            </w:pPr>
+            <w:r>
+              <w:rPr>
+                <w:rFonts w:ascii="Calibri" w:eastAsia="Microsoft YaHei"/>
+                <w:b w:val="false"/>
+                <w:bCs w:val="false"/>
+                <w:color w:val="1C262B"/>
+                <w:sz w:val="20"/>
+                <w:szCs w:val="20"/>
+              </w:rPr>
+              <w:t xml:space="preserve">inode</w:t>
+            </w:r>
+          </w:p>
+        </w:tc>
+        <w:tc>
+          <w:tcPr>
+            <w:tcW w:type="pct" w:w="3800"/>
+            <w:shd w:fill="FFFFFF" w:val="clear"/>
+            <w:tcMar>
+              <w:top w:type="dxa" w:w="60"/>
+              <w:left w:type="dxa" w:w="110"/>
+              <w:bottom w:type="dxa" w:w="60"/>
+              <w:right w:type="dxa" w:w="110"/>
+            </w:tcMar>
+          </w:tcPr>
+          <w:p>
+            <w:pPr>
+              <w:spacing w:after="0" w:line="276"/>
+              <w:jc w:val="left"/>
+            </w:pPr>
+            <w:r>
+              <w:rPr>
+                <w:rFonts w:ascii="Calibri" w:eastAsia="Microsoft YaHei"/>
+                <w:b w:val="false"/>
+                <w:bCs w:val="false"/>
+                <w:color w:val="1C262B"/>
+                <w:sz w:val="20"/>
+                <w:szCs w:val="20"/>
+              </w:rPr>
+              <w:t xml:space="preserve">the filesystem's internal record describing a file, independent of its name</w:t>
+            </w:r>
+          </w:p>
+        </w:tc>
+      </w:tr>
+      <w:tr>
+        <w:trPr>
+          <w:cantSplit/>
+        </w:trPr>
+        <w:tc>
+          <w:tcPr>
+            <w:tcW w:type="pct" w:w="1200"/>
+            <w:shd w:fill="FFFFFF" w:val="clear"/>
+            <w:tcMar>
+              <w:top w:type="dxa" w:w="60"/>
+              <w:left w:type="dxa" w:w="110"/>
+              <w:bottom w:type="dxa" w:w="60"/>
+              <w:right w:type="dxa" w:w="110"/>
+            </w:tcMar>
+          </w:tcPr>
+          <w:p>
+            <w:pPr>
+              <w:spacing w:after="0" w:line="276"/>
+              <w:jc w:val="left"/>
+            </w:pPr>
+            <w:r>
+              <w:rPr>
+                <w:rFonts w:ascii="Calibri" w:eastAsia="Microsoft YaHei"/>
+                <w:b w:val="false"/>
+                <w:bCs w:val="false"/>
+                <w:color w:val="1C262B"/>
+                <w:sz w:val="20"/>
+                <w:szCs w:val="20"/>
+              </w:rPr>
+              <w:t xml:space="preserve">dotfile</w:t>
+            </w:r>
+          </w:p>
+        </w:tc>
+        <w:tc>
+          <w:tcPr>
+            <w:tcW w:type="pct" w:w="3800"/>
+            <w:shd w:fill="FFFFFF" w:val="clear"/>
+            <w:tcMar>
+              <w:top w:type="dxa" w:w="60"/>
+              <w:left w:type="dxa" w:w="110"/>
+              <w:bottom w:type="dxa" w:w="60"/>
+              <w:right w:type="dxa" w:w="110"/>
+            </w:tcMar>
+          </w:tcPr>
+          <w:p>
+            <w:pPr>
+              <w:spacing w:after="0" w:line="276"/>
+              <w:jc w:val="left"/>
+            </w:pPr>
+            <w:r>
+              <w:rPr>
+                <w:rFonts w:ascii="Calibri" w:eastAsia="Microsoft YaHei"/>
+                <w:b w:val="false"/>
+                <w:bCs w:val="false"/>
+                <w:color w:val="1C262B"/>
+                <w:sz w:val="20"/>
+                <w:szCs w:val="20"/>
+              </w:rPr>
+              <w:t xml:space="preserve">a hidden file or folder whose name starts with a dot</w:t>
+            </w:r>
+          </w:p>
+        </w:tc>
+      </w:tr>
+      <w:tr>
+        <w:trPr>
+          <w:cantSplit/>
+        </w:trPr>
+        <w:tc>
+          <w:tcPr>
+            <w:tcW w:type="pct" w:w="1200"/>
+            <w:shd w:fill="FFFFFF" w:val="clear"/>
+            <w:tcMar>
+              <w:top w:type="dxa" w:w="60"/>
+              <w:left w:type="dxa" w:w="110"/>
+              <w:bottom w:type="dxa" w:w="60"/>
+              <w:right w:type="dxa" w:w="110"/>
+            </w:tcMar>
+          </w:tcPr>
+          <w:p>
+            <w:pPr>
+              <w:spacing w:after="0" w:line="276"/>
+              <w:jc w:val="left"/>
+            </w:pPr>
+            <w:r>
+              <w:rPr>
+                <w:rFonts w:ascii="Calibri" w:eastAsia="Microsoft YaHei"/>
+                <w:b w:val="false"/>
+                <w:bCs w:val="false"/>
+                <w:color w:val="1C262B"/>
+                <w:sz w:val="20"/>
+                <w:szCs w:val="20"/>
+              </w:rPr>
+              <w:t xml:space="preserve">offset</w:t>
+            </w:r>
+          </w:p>
+        </w:tc>
+        <w:tc>
+          <w:tcPr>
+            <w:tcW w:type="pct" w:w="3800"/>
+            <w:shd w:fill="FFFFFF" w:val="clear"/>
+            <w:tcMar>
+              <w:top w:type="dxa" w:w="60"/>
+              <w:left w:type="dxa" w:w="110"/>
+              <w:bottom w:type="dxa" w:w="60"/>
+              <w:right w:type="dxa" w:w="110"/>
+            </w:tcMar>
+          </w:tcPr>
+          <w:p>
+            <w:pPr>
+              <w:spacing w:after="0" w:line="276"/>
+              <w:jc w:val="left"/>
+            </w:pPr>
+            <w:r>
+              <w:rPr>
+                <w:rFonts w:ascii="Calibri" w:eastAsia="Microsoft YaHei"/>
+                <w:b w:val="false"/>
+                <w:bCs w:val="false"/>
+                <w:color w:val="1C262B"/>
+                <w:sz w:val="20"/>
+                <w:szCs w:val="20"/>
+              </w:rPr>
+              <w:t xml:space="preserve">a position counted in bytes from the start of a file (offset 12 = after the first 12 bytes)</w:t>
+            </w:r>
+          </w:p>
+        </w:tc>
+      </w:tr>
+      <w:tr>
+        <w:trPr>
+          <w:cantSplit/>
+        </w:trPr>
+        <w:tc>
+          <w:tcPr>
+            <w:tcW w:type="pct" w:w="1200"/>
+            <w:shd w:fill="FFFFFF" w:val="clear"/>
+            <w:tcMar>
+              <w:top w:type="dxa" w:w="60"/>
+              <w:left w:type="dxa" w:w="110"/>
+              <w:bottom w:type="dxa" w:w="60"/>
+              <w:right w:type="dxa" w:w="110"/>
+            </w:tcMar>
+          </w:tcPr>
+          <w:p>
+            <w:pPr>
+              <w:spacing w:after="0" w:line="276"/>
+              <w:jc w:val="left"/>
+            </w:pPr>
+            <w:r>
+              <w:rPr>
+                <w:rFonts w:ascii="Calibri" w:eastAsia="Microsoft YaHei"/>
+                <w:b w:val="false"/>
+                <w:bCs w:val="false"/>
+                <w:color w:val="1C262B"/>
+                <w:sz w:val="20"/>
+                <w:szCs w:val="20"/>
+              </w:rPr>
+              <w:t xml:space="preserve">hex dump</w:t>
+            </w:r>
+          </w:p>
+        </w:tc>
+        <w:tc>
+          <w:tcPr>
+            <w:tcW w:type="pct" w:w="3800"/>
+            <w:shd w:fill="FFFFFF" w:val="clear"/>
+            <w:tcMar>
+              <w:top w:type="dxa" w:w="60"/>
+              <w:left w:type="dxa" w:w="110"/>
+              <w:bottom w:type="dxa" w:w="60"/>
+              <w:right w:type="dxa" w:w="110"/>
+            </w:tcMar>
+          </w:tcPr>
+          <w:p>
+            <w:pPr>
+              <w:spacing w:after="0" w:line="276"/>
+              <w:jc w:val="left"/>
+            </w:pPr>
+            <w:r>
+              <w:rPr>
+                <w:rFonts w:ascii="Calibri" w:eastAsia="Microsoft YaHei"/>
+                <w:b w:val="false"/>
+                <w:bCs w:val="false"/>
+                <w:color w:val="1C262B"/>
+                <w:sz w:val="20"/>
+                <w:szCs w:val="20"/>
+              </w:rPr>
+              <w:t xml:space="preserve">a file's raw bytes shown as hexadecimal, e.g. with xxd</w:t>
+            </w:r>
+          </w:p>
+        </w:tc>
+      </w:tr>
+      <w:tr>
+        <w:trPr>
+          <w:cantSplit/>
+        </w:trPr>
+        <w:tc>
+          <w:tcPr>
+            <w:tcW w:type="pct" w:w="1200"/>
+            <w:shd w:fill="FFFFFF" w:val="clear"/>
+            <w:tcMar>
+              <w:top w:type="dxa" w:w="60"/>
+              <w:left w:type="dxa" w:w="110"/>
+              <w:bottom w:type="dxa" w:w="60"/>
+              <w:right w:type="dxa" w:w="110"/>
+            </w:tcMar>
+          </w:tcPr>
+          <w:p>
+            <w:pPr>
+              <w:spacing w:after="0" w:line="276"/>
+              <w:jc w:val="left"/>
+            </w:pPr>
+            <w:r>
+              <w:rPr>
+                <w:rFonts w:ascii="Calibri" w:eastAsia="Microsoft YaHei"/>
+                <w:b w:val="false"/>
+                <w:bCs w:val="false"/>
+                <w:color w:val="1C262B"/>
+                <w:sz w:val="20"/>
+                <w:szCs w:val="20"/>
+              </w:rPr>
+              <w:t xml:space="preserve">field / column</w:t>
+            </w:r>
+          </w:p>
+        </w:tc>
+        <w:tc>
+          <w:tcPr>
+            <w:tcW w:type="pct" w:w="3800"/>
+            <w:shd w:fill="FFFFFF" w:val="clear"/>
+            <w:tcMar>
+              <w:top w:type="dxa" w:w="60"/>
+              <w:left w:type="dxa" w:w="110"/>
+              <w:bottom w:type="dxa" w:w="60"/>
+              <w:right w:type="dxa" w:w="110"/>
+            </w:tcMar>
+          </w:tcPr>
+          <w:p>
+            <w:pPr>
+              <w:spacing w:after="0" w:line="276"/>
+              <w:jc w:val="left"/>
+            </w:pPr>
+            <w:r>
+              <w:rPr>
+                <w:rFonts w:ascii="Calibri" w:eastAsia="Microsoft YaHei"/>
+                <w:b w:val="false"/>
+                <w:bCs w:val="false"/>
+                <w:color w:val="1C262B"/>
+                <w:sz w:val="20"/>
+                <w:szCs w:val="20"/>
+              </w:rPr>
+              <w:t xml:space="preserve">one whitespace-separated part of a log line ($1, $2 in awk)</w:t>
+            </w:r>
+          </w:p>
+        </w:tc>
+      </w:tr>
+      <w:tr>
+        <w:trPr>
+          <w:cantSplit/>
+        </w:trPr>
+        <w:tc>
+          <w:tcPr>
+            <w:tcW w:type="pct" w:w="1200"/>
+            <w:shd w:fill="FFFFFF" w:val="clear"/>
+            <w:tcMar>
+              <w:top w:type="dxa" w:w="60"/>
+              <w:left w:type="dxa" w:w="110"/>
+              <w:bottom w:type="dxa" w:w="60"/>
+              <w:right w:type="dxa" w:w="110"/>
+            </w:tcMar>
+          </w:tcPr>
+          <w:p>
+            <w:pPr>
+              <w:spacing w:after="0" w:line="276"/>
+              <w:jc w:val="left"/>
+            </w:pPr>
+            <w:r>
+              <w:rPr>
+                <w:rFonts w:ascii="Calibri" w:eastAsia="Microsoft YaHei"/>
+                <w:b w:val="false"/>
+                <w:bCs w:val="false"/>
+                <w:color w:val="1C262B"/>
+                <w:sz w:val="20"/>
+                <w:szCs w:val="20"/>
+              </w:rPr>
+              <w:t xml:space="preserve">pipeline ( | )</w:t>
+            </w:r>
+          </w:p>
+        </w:tc>
+        <w:tc>
+          <w:tcPr>
+            <w:tcW w:type="pct" w:w="3800"/>
+            <w:shd w:fill="FFFFFF" w:val="clear"/>
+            <w:tcMar>
+              <w:top w:type="dxa" w:w="60"/>
+              <w:left w:type="dxa" w:w="110"/>
+              <w:bottom w:type="dxa" w:w="60"/>
+              <w:right w:type="dxa" w:w="110"/>
+            </w:tcMar>
+          </w:tcPr>
+          <w:p>
+            <w:pPr>
+              <w:spacing w:after="0" w:line="276"/>
+              <w:jc w:val="left"/>
+            </w:pPr>
+            <w:r>
+              <w:rPr>
+                <w:rFonts w:ascii="Calibri" w:eastAsia="Microsoft YaHei"/>
+                <w:b w:val="false"/>
+                <w:bCs w:val="false"/>
+                <w:color w:val="1C262B"/>
+                <w:sz w:val="20"/>
+                <w:szCs w:val="20"/>
+              </w:rPr>
+              <w:t xml:space="preserve">connects commands: the standard output of the left command feeds the standard input of the right</w:t>
+            </w:r>
+          </w:p>
+        </w:tc>
+      </w:tr>
+      <w:tr>
+        <w:trPr>
+          <w:cantSplit/>
+        </w:trPr>
+        <w:tc>
+          <w:tcPr>
+            <w:tcW w:type="pct" w:w="1200"/>
+            <w:shd w:fill="FFFFFF" w:val="clear"/>
+            <w:tcMar>
+              <w:top w:type="dxa" w:w="60"/>
+              <w:left w:type="dxa" w:w="110"/>
+              <w:bottom w:type="dxa" w:w="60"/>
+              <w:right w:type="dxa" w:w="110"/>
+            </w:tcMar>
+          </w:tcPr>
+          <w:p>
+            <w:pPr>
+              <w:spacing w:after="0" w:line="276"/>
+              <w:jc w:val="left"/>
+            </w:pPr>
+            <w:r>
+              <w:rPr>
+                <w:rFonts w:ascii="Calibri" w:eastAsia="Microsoft YaHei"/>
+                <w:b w:val="false"/>
+                <w:bCs w:val="false"/>
+                <w:color w:val="1C262B"/>
+                <w:sz w:val="20"/>
+                <w:szCs w:val="20"/>
+              </w:rPr>
+              <w:t xml:space="preserve">URL encoding</w:t>
+            </w:r>
+          </w:p>
+        </w:tc>
+        <w:tc>
+          <w:tcPr>
+            <w:tcW w:type="pct" w:w="3800"/>
+            <w:shd w:fill="FFFFFF" w:val="clear"/>
+            <w:tcMar>
+              <w:top w:type="dxa" w:w="60"/>
+              <w:left w:type="dxa" w:w="110"/>
+              <w:bottom w:type="dxa" w:w="60"/>
+              <w:right w:type="dxa" w:w="110"/>
+            </w:tcMar>
+          </w:tcPr>
+          <w:p>
+            <w:pPr>
+              <w:spacing w:after="0" w:line="276"/>
+              <w:jc w:val="left"/>
+            </w:pPr>
+            <w:r>
+              <w:rPr>
+                <w:rFonts w:ascii="Calibri" w:eastAsia="Microsoft YaHei"/>
+                <w:b w:val="false"/>
+                <w:bCs w:val="false"/>
+                <w:color w:val="1C262B"/>
+                <w:sz w:val="20"/>
+                <w:szCs w:val="20"/>
+              </w:rPr>
+              <w:t xml:space="preserve">representing special characters as %XX (a brace { becomes %7B) inside URLs</w:t>
+            </w:r>
+          </w:p>
+        </w:tc>
+      </w:tr>
+      <w:tr>
+        <w:trPr>
+          <w:cantSplit/>
+        </w:trPr>
+        <w:tc>
+          <w:tcPr>
+            <w:tcW w:type="pct" w:w="1200"/>
+            <w:shd w:fill="FFFFFF" w:val="clear"/>
+            <w:tcMar>
+              <w:top w:type="dxa" w:w="60"/>
+              <w:left w:type="dxa" w:w="110"/>
+              <w:bottom w:type="dxa" w:w="60"/>
+              <w:right w:type="dxa" w:w="110"/>
+            </w:tcMar>
+          </w:tcPr>
+          <w:p>
+            <w:pPr>
+              <w:spacing w:after="0" w:line="276"/>
+              <w:jc w:val="left"/>
+            </w:pPr>
+            <w:r>
+              <w:rPr>
+                <w:rFonts w:ascii="Calibri" w:eastAsia="Microsoft YaHei"/>
+                <w:b w:val="false"/>
+                <w:bCs w:val="false"/>
+                <w:color w:val="1C262B"/>
+                <w:sz w:val="20"/>
+                <w:szCs w:val="20"/>
+              </w:rPr>
+              <w:t xml:space="preserve">setuid bit</w:t>
+            </w:r>
+          </w:p>
+        </w:tc>
+        <w:tc>
+          <w:tcPr>
+            <w:tcW w:type="pct" w:w="3800"/>
+            <w:shd w:fill="FFFFFF" w:val="clear"/>
+            <w:tcMar>
+              <w:top w:type="dxa" w:w="60"/>
+              <w:left w:type="dxa" w:w="110"/>
+              <w:bottom w:type="dxa" w:w="60"/>
+              <w:right w:type="dxa" w:w="110"/>
+            </w:tcMar>
+          </w:tcPr>
+          <w:p>
+            <w:pPr>
+              <w:spacing w:after="0" w:line="276"/>
+              <w:jc w:val="left"/>
+            </w:pPr>
+            <w:r>
+              <w:rPr>
+                <w:rFonts w:ascii="Calibri" w:eastAsia="Microsoft YaHei"/>
+                <w:b w:val="false"/>
+                <w:bCs w:val="false"/>
+                <w:color w:val="1C262B"/>
+                <w:sz w:val="20"/>
+                <w:szCs w:val="20"/>
+              </w:rPr>
+              <w:t xml:space="preserve">a permission flag letting a file run with its owner's privileges</w:t>
+            </w:r>
+          </w:p>
+        </w:tc>
+      </w:tr>
+      <w:tr>
+        <w:trPr>
+          <w:cantSplit/>
+        </w:trPr>
+        <w:tc>
+          <w:tcPr>
+            <w:tcW w:type="pct" w:w="1200"/>
+            <w:shd w:fill="FFFFFF" w:val="clear"/>
+            <w:tcMar>
+              <w:top w:type="dxa" w:w="60"/>
+              <w:left w:type="dxa" w:w="110"/>
+              <w:bottom w:type="dxa" w:w="60"/>
+              <w:right w:type="dxa" w:w="110"/>
+            </w:tcMar>
+          </w:tcPr>
+          <w:p>
+            <w:pPr>
+              <w:spacing w:after="0" w:line="276"/>
+              <w:jc w:val="left"/>
+            </w:pPr>
+            <w:r>
+              <w:rPr>
+                <w:rFonts w:ascii="Calibri" w:eastAsia="Microsoft YaHei"/>
+                <w:b w:val="false"/>
+                <w:bCs w:val="false"/>
+                <w:color w:val="1C262B"/>
+                <w:sz w:val="20"/>
+                <w:szCs w:val="20"/>
+              </w:rPr>
+              <w:t xml:space="preserve">listening socket</w:t>
+            </w:r>
+          </w:p>
+        </w:tc>
+        <w:tc>
+          <w:tcPr>
+            <w:tcW w:type="pct" w:w="3800"/>
+            <w:shd w:fill="FFFFFF" w:val="clear"/>
+            <w:tcMar>
+              <w:top w:type="dxa" w:w="60"/>
+              <w:left w:type="dxa" w:w="110"/>
+              <w:bottom w:type="dxa" w:w="60"/>
+              <w:right w:type="dxa" w:w="110"/>
+            </w:tcMar>
+          </w:tcPr>
+          <w:p>
+            <w:pPr>
+              <w:spacing w:after="0" w:line="276"/>
+              <w:jc w:val="left"/>
+            </w:pPr>
+            <w:r>
+              <w:rPr>
+                <w:rFonts w:ascii="Calibri" w:eastAsia="Microsoft YaHei"/>
+                <w:b w:val="false"/>
+                <w:bCs w:val="false"/>
+                <w:color w:val="1C262B"/>
+                <w:sz w:val="20"/>
+                <w:szCs w:val="20"/>
+              </w:rPr>
+              <w:t xml:space="preserve">a port where a program waits for incoming connections</w:t>
+            </w:r>
+          </w:p>
+        </w:tc>
+      </w:tr>
+      <w:tr>
+        <w:trPr>
+          <w:cantSplit/>
+        </w:trPr>
+        <w:tc>
+          <w:tcPr>
+            <w:tcW w:type="pct" w:w="1200"/>
+            <w:shd w:fill="FFFFFF" w:val="clear"/>
+            <w:tcMar>
+              <w:top w:type="dxa" w:w="60"/>
+              <w:left w:type="dxa" w:w="110"/>
+              <w:bottom w:type="dxa" w:w="60"/>
+              <w:right w:type="dxa" w:w="110"/>
+            </w:tcMar>
+          </w:tcPr>
+          <w:p>
+            <w:pPr>
+              <w:spacing w:after="0" w:line="276"/>
+              <w:jc w:val="left"/>
+            </w:pPr>
+            <w:r>
+              <w:rPr>
+                <w:rFonts w:ascii="Calibri" w:eastAsia="Microsoft YaHei"/>
+                <w:b w:val="false"/>
+                <w:bCs w:val="false"/>
+                <w:color w:val="1C262B"/>
+                <w:sz w:val="20"/>
+                <w:szCs w:val="20"/>
+              </w:rPr>
+              <w:t xml:space="preserve">brute force</w:t>
+            </w:r>
+          </w:p>
+        </w:tc>
+        <w:tc>
+          <w:tcPr>
+            <w:tcW w:type="pct" w:w="3800"/>
+            <w:shd w:fill="FFFFFF" w:val="clear"/>
+            <w:tcMar>
+              <w:top w:type="dxa" w:w="60"/>
+              <w:left w:type="dxa" w:w="110"/>
+              <w:bottom w:type="dxa" w:w="60"/>
+              <w:right w:type="dxa" w:w="110"/>
+            </w:tcMar>
+          </w:tcPr>
+          <w:p>
+            <w:pPr>
+              <w:spacing w:after="0" w:line="276"/>
+              <w:jc w:val="left"/>
+            </w:pPr>
+            <w:r>
+              <w:rPr>
+                <w:rFonts w:ascii="Calibri" w:eastAsia="Microsoft YaHei"/>
+                <w:b w:val="false"/>
+                <w:bCs w:val="false"/>
+                <w:color w:val="1C262B"/>
+                <w:sz w:val="20"/>
+                <w:szCs w:val="20"/>
+              </w:rPr>
+              <w:t xml:space="preserve">trying many passwords or values until one works</w:t>
+            </w:r>
+          </w:p>
+        </w:tc>
+      </w:tr>
+      <w:tr>
+        <w:trPr>
+          <w:cantSplit/>
+        </w:trPr>
+        <w:tc>
+          <w:tcPr>
+            <w:tcW w:type="pct" w:w="1200"/>
+            <w:shd w:fill="FFFFFF" w:val="clear"/>
+            <w:tcMar>
+              <w:top w:type="dxa" w:w="60"/>
+              <w:left w:type="dxa" w:w="110"/>
+              <w:bottom w:type="dxa" w:w="60"/>
+              <w:right w:type="dxa" w:w="110"/>
+            </w:tcMar>
+          </w:tcPr>
+          <w:p>
+            <w:pPr>
+              <w:spacing w:after="0" w:line="276"/>
+              <w:jc w:val="left"/>
+            </w:pPr>
+            <w:r>
+              <w:rPr>
+                <w:rFonts w:ascii="Calibri" w:eastAsia="Microsoft YaHei"/>
+                <w:b w:val="false"/>
+                <w:bCs w:val="false"/>
+                <w:color w:val="1C262B"/>
+                <w:sz w:val="20"/>
+                <w:szCs w:val="20"/>
+              </w:rPr>
+              <w:t xml:space="preserve">reconnaissance</w:t>
+            </w:r>
+          </w:p>
+        </w:tc>
+        <w:tc>
+          <w:tcPr>
+            <w:tcW w:type="pct" w:w="3800"/>
+            <w:shd w:fill="FFFFFF" w:val="clear"/>
+            <w:tcMar>
+              <w:top w:type="dxa" w:w="60"/>
+              <w:left w:type="dxa" w:w="110"/>
+              <w:bottom w:type="dxa" w:w="60"/>
+              <w:right w:type="dxa" w:w="110"/>
+            </w:tcMar>
+          </w:tcPr>
+          <w:p>
+            <w:pPr>
+              <w:spacing w:after="0" w:line="276"/>
+              <w:jc w:val="left"/>
+            </w:pPr>
+            <w:r>
+              <w:rPr>
+                <w:rFonts w:ascii="Calibri" w:eastAsia="Microsoft YaHei"/>
+                <w:b w:val="false"/>
+                <w:bCs w:val="false"/>
+                <w:color w:val="1C262B"/>
+                <w:sz w:val="20"/>
+                <w:szCs w:val="20"/>
+              </w:rPr>
+              <w:t xml:space="preserve">preliminary probing of a system before an attack</w:t>
             </w:r>
           </w:p>
         </w:tc>

</xml_diff>